<commit_message>
barlow/finesst: v10 working - spell out Objective 1/2/3 (9 tokens) + DAPR scrub
No shorthand left (O1/O2/O3 -> Objective N everywhere incl. Fig 2 caption and
timeline); lastModifiedBy 'Craig Glennie' blanked for dual-anonymous review.
Growth absorbed - body still 6 pp, References still opens p7. No trims needed.

Co-Authored-By: Claude Fable 5 <noreply@anthropic.com>
</commit_message>
<xml_diff>
--- a/barlow/finesst_final_v2/finesst_proposal_v10_working.docx
+++ b/barlow/finesst_final_v2/finesst_proposal_v10_working.docx
@@ -542,7 +542,7 @@
         <w:t xml:space="preserve"> (</w:t>
       </w:r>
       <w:r>
-        <w:t>O1)</w:t>
+        <w:t xml:space="preserve">Objective 1)</w:t>
       </w:r>
       <w:r>
         <w:t xml:space="preserve">. Determination of the climate and landscape drivers that control each stream's rate of geomorphic change. Candidate controls fall into two groups. Climate forcing — air temperature, incoming sunlight, meltwater discharge, glacial mass balance, and summer thaw — comes from the McMurdo Dry Valleys LTER network [8], with ERA5 [9] and AMPS reanalysis filling coverage gaps. Substrate susceptibility — microclimate zone, mapped permafrost and ground-ice class, and bed material — comes from published MDV mapping [10], [11]. We hypothesize that, after controlling for substrate, melt energy will predict channel change better than water volume alone (H1); forcing should matter most where ground ice is present. The hypothesis is testable: if discharge alone predicts channel migration as well as melt energy does, or if substrate class alone absorbs the explanatory power, the hypothesis fails.</w:t>
@@ -564,7 +564,7 @@
         <w:t>attribution along the stream corridor</w:t>
       </w:r>
       <w:r>
-        <w:t xml:space="preserve"> (O2)</w:t>
+        <w:t xml:space="preserve"> (Objective 2)</w:t>
       </w:r>
       <w:r>
         <w:t>. Beyond the channel centerline, classify change in the near-channel corridor — channel shift and avulsion, bank thaw and subsidence, and fan growth — by process type. Bedrock and stable soils outside the corridor provide the fixed reference used to georeference the REMA satellite DEM to the airborne lidar, so change is measured against genuinely stable ground rather than an assumption that the whole surface is moving.</w:t>
@@ -585,7 +585,7 @@
         <w:t>Calibrated uncertainty</w:t>
       </w:r>
       <w:r>
-        <w:t xml:space="preserve"> (O3)</w:t>
+        <w:t xml:space="preserve"> (Objective 3)</w:t>
       </w:r>
       <w:r>
         <w:t xml:space="preserve">. </w:t>
@@ -704,7 +704,7 @@
           <w:i/>
           <w:color w:val="404040"/>
         </w:rPr>
-        <w:t xml:space="preserve"> DEM-of-Difference, per-pixel detection floor, then the O1 (channel), O2 </w:t>
+        <w:t xml:space="preserve"> DEM-of-Difference, per-pixel detection floor, then the Objective 1 (channel), Objective 2 </w:t>
       </w:r>
       <w:r>
         <w:rPr>
@@ -718,7 +718,7 @@
           <w:i/>
           <w:color w:val="404040"/>
         </w:rPr>
-        <w:t xml:space="preserve"> and O3 (uncertainty) objectives. Method schematic; no results shown.</w:t>
+        <w:t xml:space="preserve"> and Objective 3 (uncertainty) objectives. Method schematic; no results shown.</w:t>
       </w:r>
     </w:p>
     <w:p>
@@ -2056,7 +2056,7 @@
                 <w:rFonts w:ascii="Times New Roman" w:hAnsi="Times New Roman"/>
                 <w:sz w:val="18"/>
               </w:rPr>
-              <w:t>Rebuild the change-detection chain from public data; harmonize driver records per stream; secure or rebuild training labels; first attribution model (O1, Taylor Valley)</w:t>
+              <w:t xml:space="preserve">Rebuild the change-detection chain from public data; harmonize driver records per stream; secure or rebuild training labels; first attribution model (Objective 1, Taylor Valley)</w:t>
             </w:r>
           </w:p>
         </w:tc>
@@ -2119,7 +2119,7 @@
                 <w:rFonts w:ascii="Times New Roman" w:hAnsi="Times New Roman"/>
                 <w:sz w:val="18"/>
               </w:rPr>
-              <w:t xml:space="preserve"> (O2), gated by the O3 thresholds; driver tests per change type; sensor-disagreement correction</w:t>
+              <w:t xml:space="preserve"> (Objective 2), gated by the Objective 3 thresholds; driver tests per change type; sensor-disagreement correction</w:t>
             </w:r>
           </w:p>
         </w:tc>

</xml_diff>